<commit_message>
Update vaje 6 rand
</commit_message>
<xml_diff>
--- a/06_Naključna_števila/07_Naključna_števila.docx
+++ b/06_Naključna_števila/07_Naključna_števila.docx
@@ -1,6 +1,6 @@
 
 <file path=word/document.xml><?xml version="1.0" encoding="utf-8"?>
-<w:document xmlns:wpc="http://schemas.microsoft.com/office/word/2010/wordprocessingCanvas" xmlns:cx="http://schemas.microsoft.com/office/drawing/2014/chartex" xmlns:cx1="http://schemas.microsoft.com/office/drawing/2015/9/8/chartex" xmlns:cx2="http://schemas.microsoft.com/office/drawing/2015/10/21/chartex" xmlns:cx3="http://schemas.microsoft.com/office/drawing/2016/5/9/chartex" xmlns:cx4="http://schemas.microsoft.com/office/drawing/2016/5/10/chartex" xmlns:cx5="http://schemas.microsoft.com/office/drawing/2016/5/11/chartex" xmlns:cx6="http://schemas.microsoft.com/office/drawing/2016/5/12/chartex" xmlns:cx7="http://schemas.microsoft.com/office/drawing/2016/5/13/chartex" xmlns:cx8="http://schemas.microsoft.com/office/drawing/2016/5/14/chartex" xmlns:mc="http://schemas.openxmlformats.org/markup-compatibility/2006" xmlns:aink="http://schemas.microsoft.com/office/drawing/2016/ink" xmlns:am3d="http://schemas.microsoft.com/office/drawing/2017/model3d" xmlns:o="urn:schemas-microsoft-com:office:office" xmlns:oel="http://schemas.microsoft.com/office/2019/extlst" xmlns:r="http://schemas.openxmlformats.org/officeDocument/2006/relationships" xmlns:m="http://schemas.openxmlformats.org/officeDocument/2006/math" xmlns:v="urn:schemas-microsoft-com:vml" xmlns:wp14="http://schemas.microsoft.com/office/word/2010/wordprocessingDrawing" xmlns:wp="http://schemas.openxmlformats.org/drawingml/2006/wordprocessingDrawing" xmlns:w10="urn:schemas-microsoft-com:office:word" xmlns:w="http://schemas.openxmlformats.org/wordprocessingml/2006/main" xmlns:w14="http://schemas.microsoft.com/office/word/2010/wordml" xmlns:w15="http://schemas.microsoft.com/office/word/2012/wordml" xmlns:w16cex="http://schemas.microsoft.com/office/word/2018/wordml/cex" xmlns:w16cid="http://schemas.microsoft.com/office/word/2016/wordml/cid" xmlns:w16="http://schemas.microsoft.com/office/word/2018/wordml" xmlns:w16du="http://schemas.microsoft.com/office/word/2023/wordml/word16du" xmlns:w16sdtdh="http://schemas.microsoft.com/office/word/2020/wordml/sdtdatahash" xmlns:w16se="http://schemas.microsoft.com/office/word/2015/wordml/symex" xmlns:wpg="http://schemas.microsoft.com/office/word/2010/wordprocessingGroup" xmlns:wpi="http://schemas.microsoft.com/office/word/2010/wordprocessingInk" xmlns:wne="http://schemas.microsoft.com/office/word/2006/wordml" xmlns:wps="http://schemas.microsoft.com/office/word/2010/wordprocessingShape" mc:Ignorable="w14 w15 w16se w16cid w16 w16cex w16sdtdh wp14">
+<w:document xmlns:wpc="http://schemas.microsoft.com/office/word/2010/wordprocessingCanvas" xmlns:cx="http://schemas.microsoft.com/office/drawing/2014/chartex" xmlns:cx1="http://schemas.microsoft.com/office/drawing/2015/9/8/chartex" xmlns:cx2="http://schemas.microsoft.com/office/drawing/2015/10/21/chartex" xmlns:cx3="http://schemas.microsoft.com/office/drawing/2016/5/9/chartex" xmlns:cx4="http://schemas.microsoft.com/office/drawing/2016/5/10/chartex" xmlns:cx5="http://schemas.microsoft.com/office/drawing/2016/5/11/chartex" xmlns:cx6="http://schemas.microsoft.com/office/drawing/2016/5/12/chartex" xmlns:cx7="http://schemas.microsoft.com/office/drawing/2016/5/13/chartex" xmlns:cx8="http://schemas.microsoft.com/office/drawing/2016/5/14/chartex" xmlns:mc="http://schemas.openxmlformats.org/markup-compatibility/2006" xmlns:aink="http://schemas.microsoft.com/office/drawing/2016/ink" xmlns:am3d="http://schemas.microsoft.com/office/drawing/2017/model3d" xmlns:o="urn:schemas-microsoft-com:office:office" xmlns:oel="http://schemas.microsoft.com/office/2019/extlst" xmlns:r="http://schemas.openxmlformats.org/officeDocument/2006/relationships" xmlns:m="http://schemas.openxmlformats.org/officeDocument/2006/math" xmlns:v="urn:schemas-microsoft-com:vml" xmlns:wp14="http://schemas.microsoft.com/office/word/2010/wordprocessingDrawing" xmlns:wp="http://schemas.openxmlformats.org/drawingml/2006/wordprocessingDrawing" xmlns:w10="urn:schemas-microsoft-com:office:word" xmlns:w="http://schemas.openxmlformats.org/wordprocessingml/2006/main" xmlns:w14="http://schemas.microsoft.com/office/word/2010/wordml" xmlns:w15="http://schemas.microsoft.com/office/word/2012/wordml" xmlns:w16cex="http://schemas.microsoft.com/office/word/2018/wordml/cex" xmlns:w16cid="http://schemas.microsoft.com/office/word/2016/wordml/cid" xmlns:w16="http://schemas.microsoft.com/office/word/2018/wordml" xmlns:w16du="http://schemas.microsoft.com/office/word/2023/wordml/word16du" xmlns:w16sdtdh="http://schemas.microsoft.com/office/word/2020/wordml/sdtdatahash" xmlns:w16sdtfl="http://schemas.microsoft.com/office/word/2024/wordml/sdtformatlock" xmlns:w16se="http://schemas.microsoft.com/office/word/2015/wordml/symex" xmlns:wpg="http://schemas.microsoft.com/office/word/2010/wordprocessingGroup" xmlns:wpi="http://schemas.microsoft.com/office/word/2010/wordprocessingInk" xmlns:wne="http://schemas.microsoft.com/office/word/2006/wordml" xmlns:wps="http://schemas.microsoft.com/office/word/2010/wordprocessingShape" mc:Ignorable="w14 w15 w16se w16cid w16 w16cex w16sdtdh w16sdtfl w16du wp14">
   <w:background w:color="FFFFFF"/>
   <w:body>
     <w:p>
@@ -30,13 +30,7 @@
     </w:p>
     <w:p>
       <w:r>
-        <w:t>V programskem jeziku C/C++ u</w:t>
-      </w:r>
-      <w:r>
-        <w:t xml:space="preserve">stvarite </w:t>
-      </w:r>
-      <w:r>
-        <w:t>funkcije, s katerimi boste lahko generirali spodaj navedene tipe naključnih števil:</w:t>
+        <w:t>V programskem jeziku C/C++ ustvarite funkcije, s katerimi boste lahko generirali spodaj navedene tipe naključnih števil:</w:t>
       </w:r>
     </w:p>
     <w:p>
@@ -289,13 +283,176 @@
         <w:t>Pri tej vaju uporabite ustrezen generator naključnih števil in določite vrednost števila pi. V teku simulacije ustrezne podatke shranjujte v datoteko. Datoteko nato uvozite v ustrezen program, s katerim boste lahko analizirali, kako se spreminja napaka izračunane vrednosti števila pi od dejanske vrednosti števila pi, ki jo uporablja računalnik.</w:t>
       </w:r>
     </w:p>
-    <w:p/>
+    <w:p>
+      <w:pPr>
+        <w:jc w:val="both"/>
+      </w:pPr>
+    </w:p>
+    <w:p>
+      <w:pPr>
+        <w:jc w:val="both"/>
+        <w:rPr>
+          <w:b/>
+          <w:bCs/>
+          <w:sz w:val="28"/>
+          <w:szCs w:val="28"/>
+        </w:rPr>
+      </w:pPr>
+      <w:r>
+        <w:rPr>
+          <w:b/>
+          <w:bCs/>
+          <w:sz w:val="28"/>
+          <w:szCs w:val="28"/>
+        </w:rPr>
+        <w:t>Vaja 3</w:t>
+      </w:r>
+    </w:p>
+    <w:p>
+      <w:pPr>
+        <w:jc w:val="both"/>
+      </w:pPr>
+      <w:r>
+        <w:t xml:space="preserve">V tej vaji boste s pomočjo simulacije obravnavali znani problem </w:t>
+      </w:r>
+      <w:proofErr w:type="spellStart"/>
+      <w:r>
+        <w:t>Monty</w:t>
+      </w:r>
+      <w:proofErr w:type="spellEnd"/>
+      <w:r>
+        <w:t xml:space="preserve"> Hall.</w:t>
+      </w:r>
+      <w:r>
+        <w:t xml:space="preserve"> </w:t>
+      </w:r>
+      <w:r>
+        <w:t xml:space="preserve">V igri nastopajo tri vrata, za katerimi se skriva ena nagrada (npr. avtomobil), za ostalima dvema pa ne (npr. koza). Igralec najprej naključno izbere ena vrata. Voditelj nato odpre ena izmed preostalih dveh vrat, za katerimi </w:t>
+      </w:r>
+      <w:r>
+        <w:rPr>
+          <w:b/>
+          <w:bCs/>
+        </w:rPr>
+        <w:t>zagotovo ni nagrade</w:t>
+      </w:r>
+      <w:r>
+        <w:t>. Igralec ima nato možnost, da vztraja pri prvotni izbiri ali pa zamenja vrata.</w:t>
+      </w:r>
+      <w:r>
+        <w:t xml:space="preserve"> </w:t>
+      </w:r>
+      <w:r>
+        <w:t xml:space="preserve">Vaša naloga je, da s pomočjo generatorja naključnih števil izvedete simulacijo igre </w:t>
+      </w:r>
+      <w:proofErr w:type="spellStart"/>
+      <w:r>
+        <w:t>Monty</w:t>
+      </w:r>
+      <w:proofErr w:type="spellEnd"/>
+      <w:r>
+        <w:t xml:space="preserve"> Hall in statistično preverite uspešnost obeh strategij:</w:t>
+      </w:r>
+    </w:p>
+    <w:p>
+      <w:pPr>
+        <w:pStyle w:val="Odstavekseznama"/>
+        <w:numPr>
+          <w:ilvl w:val="0"/>
+          <w:numId w:val="2"/>
+        </w:numPr>
+        <w:jc w:val="both"/>
+      </w:pPr>
+      <w:r>
+        <w:t>strategije, pri kateri igralec ne zamenja začetne izbire,</w:t>
+      </w:r>
+    </w:p>
+    <w:p>
+      <w:pPr>
+        <w:pStyle w:val="Odstavekseznama"/>
+        <w:numPr>
+          <w:ilvl w:val="0"/>
+          <w:numId w:val="2"/>
+        </w:numPr>
+        <w:jc w:val="both"/>
+      </w:pPr>
+      <w:r>
+        <w:t>strategije, pri kateri igralec vedno zamenja izbiro po tem, ko voditelj odpre ena vrata.</w:t>
+      </w:r>
+    </w:p>
+    <w:p>
+      <w:pPr>
+        <w:jc w:val="both"/>
+      </w:pPr>
+      <w:r>
+        <w:t>Simulacijo izvedite za večje število ponovitev in beležite število zmag v obeh primerih. Na podlagi zbranih rezultatov izračunajte relativno verjetnost zmage za posamezno strategijo ter rezultate grafično in numerično analizirajte.</w:t>
+      </w:r>
+    </w:p>
+    <w:p>
+      <w:r>
+        <w:rPr>
+          <w:noProof/>
+        </w:rPr>
+        <w:drawing>
+          <wp:inline distT="0" distB="0" distL="0" distR="0" wp14:anchorId="28671093" wp14:editId="14772215">
+            <wp:extent cx="1227483" cy="682066"/>
+            <wp:effectExtent l="0" t="0" r="0" b="3810"/>
+            <wp:docPr id="302424293" name="Slika 1" descr="undefined"/>
+            <wp:cNvGraphicFramePr>
+              <a:graphicFrameLocks xmlns:a="http://schemas.openxmlformats.org/drawingml/2006/main" noChangeAspect="1"/>
+            </wp:cNvGraphicFramePr>
+            <a:graphic xmlns:a="http://schemas.openxmlformats.org/drawingml/2006/main">
+              <a:graphicData uri="http://schemas.openxmlformats.org/drawingml/2006/picture">
+                <pic:pic xmlns:pic="http://schemas.openxmlformats.org/drawingml/2006/picture">
+                  <pic:nvPicPr>
+                    <pic:cNvPr id="0" name="Picture 1" descr="undefined"/>
+                    <pic:cNvPicPr>
+                      <a:picLocks noChangeAspect="1" noChangeArrowheads="1"/>
+                    </pic:cNvPicPr>
+                  </pic:nvPicPr>
+                  <pic:blipFill>
+                    <a:blip r:embed="rId5" cstate="print">
+                      <a:extLst>
+                        <a:ext uri="{28A0092B-C50C-407E-A947-70E740481C1C}">
+                          <a14:useLocalDpi xmlns:a14="http://schemas.microsoft.com/office/drawing/2010/main" val="0"/>
+                        </a:ext>
+                      </a:extLst>
+                    </a:blip>
+                    <a:srcRect/>
+                    <a:stretch>
+                      <a:fillRect/>
+                    </a:stretch>
+                  </pic:blipFill>
+                  <pic:spPr bwMode="auto">
+                    <a:xfrm>
+                      <a:off x="0" y="0"/>
+                      <a:ext cx="1238126" cy="687980"/>
+                    </a:xfrm>
+                    <a:prstGeom prst="rect">
+                      <a:avLst/>
+                    </a:prstGeom>
+                    <a:noFill/>
+                    <a:ln>
+                      <a:noFill/>
+                    </a:ln>
+                  </pic:spPr>
+                </pic:pic>
+              </a:graphicData>
+            </a:graphic>
+          </wp:inline>
+        </w:drawing>
+      </w:r>
+    </w:p>
     <w:p>
       <w:pPr>
         <w:pStyle w:val="Naslov"/>
       </w:pPr>
       <w:r>
-        <w:t>Vaja 3</w:t>
+        <w:lastRenderedPageBreak/>
+        <w:t xml:space="preserve">Vaja </w:t>
+      </w:r>
+      <w:r>
+        <w:t>4</w:t>
       </w:r>
     </w:p>
     <w:p>
@@ -316,13 +473,7 @@
         <w:t>N</w:t>
       </w:r>
       <w:r>
-        <w:t xml:space="preserve"> krat. V vsaki iteracije igre se izžreba 7 števil </w:t>
-      </w:r>
-      <w:r>
-        <w:t>različnih števil med 1 in 39 (vključno z 1 in 39)</w:t>
-      </w:r>
-      <w:r>
-        <w:t>. Po tem se preveri, koliko števil iz seznama števil igralca se ujema s števili, ki so bila izžrebana. V teku simulacije spremljajte koliko krat, je igralec imel določeno število enakih števil v svojem polju števil oz.</w:t>
+        <w:t xml:space="preserve"> krat. V vsaki iteracije igre se izžreba 7 števil različnih števil med 1 in 39 (vključno z 1 in 39). Po tem se preveri, koliko števil iz seznama števil igralca se ujema s števili, ki so bila izžrebana. V teku simulacije spremljajte koliko krat, je igralec imel določeno število enakih števil v svojem polju števil oz.</w:t>
       </w:r>
       <w:r>
         <w:t>, koliko krat igralec zadane 1, 2, 3, 4, 5, 6 ali 7 pravilnih kombinacij števil.</w:t>
@@ -345,6 +496,207 @@
           <w:color w:val="FF0000"/>
         </w:rPr>
         <w:t>Domača naloga</w:t>
+      </w:r>
+      <w:r>
+        <w:rPr>
+          <w:color w:val="FF0000"/>
+        </w:rPr>
+        <w:t xml:space="preserve"> </w:t>
+      </w:r>
+      <w:r>
+        <w:rPr>
+          <w:color w:val="FF0000"/>
+        </w:rPr>
+        <w:t>1</w:t>
+      </w:r>
+    </w:p>
+    <w:p>
+      <w:pPr>
+        <w:jc w:val="both"/>
+        <w:rPr>
+          <w:color w:val="FF0000"/>
+        </w:rPr>
+      </w:pPr>
+      <w:r>
+        <w:rPr>
+          <w:color w:val="FF0000"/>
+        </w:rPr>
+        <w:t xml:space="preserve">Razširite problem </w:t>
+      </w:r>
+      <w:proofErr w:type="spellStart"/>
+      <w:r>
+        <w:rPr>
+          <w:color w:val="FF0000"/>
+        </w:rPr>
+        <w:t>Monty</w:t>
+      </w:r>
+      <w:proofErr w:type="spellEnd"/>
+      <w:r>
+        <w:rPr>
+          <w:color w:val="FF0000"/>
+        </w:rPr>
+        <w:t xml:space="preserve"> Hall na primere s 4, 5 in 6 vrati.</w:t>
+      </w:r>
+      <w:r>
+        <w:rPr>
+          <w:color w:val="FF0000"/>
+        </w:rPr>
+        <w:t xml:space="preserve"> </w:t>
+      </w:r>
+      <w:r>
+        <w:rPr>
+          <w:color w:val="FF0000"/>
+        </w:rPr>
+        <w:t xml:space="preserve">Pri vsakem primeru je za enimi vrati skrita nagrada, za ostalimi pa ne. Igralec najprej naključno izbere ena vrata. Voditelj nato odpre </w:t>
+      </w:r>
+      <w:r>
+        <w:rPr>
+          <w:color w:val="FF0000"/>
+        </w:rPr>
+        <w:t xml:space="preserve">ena </w:t>
+      </w:r>
+      <w:r>
+        <w:rPr>
+          <w:color w:val="FF0000"/>
+        </w:rPr>
+        <w:t>vrat</w:t>
+      </w:r>
+      <w:r>
+        <w:rPr>
+          <w:color w:val="FF0000"/>
+        </w:rPr>
+        <w:t>a</w:t>
+      </w:r>
+      <w:r>
+        <w:rPr>
+          <w:color w:val="FF0000"/>
+        </w:rPr>
+        <w:t>, za katerimi zagotovo ni nagrade</w:t>
+      </w:r>
+      <w:r>
+        <w:rPr>
+          <w:color w:val="FF0000"/>
+        </w:rPr>
+        <w:t>. To ponavlja, vse dokler ne ostaneta,</w:t>
+      </w:r>
+      <w:r>
+        <w:rPr>
+          <w:color w:val="FF0000"/>
+        </w:rPr>
+        <w:t xml:space="preserve"> da ostaneta zaprti</w:t>
+      </w:r>
+      <w:r>
+        <w:rPr>
+          <w:color w:val="FF0000"/>
+        </w:rPr>
+        <w:t xml:space="preserve"> le še</w:t>
+      </w:r>
+      <w:r>
+        <w:rPr>
+          <w:color w:val="FF0000"/>
+        </w:rPr>
+        <w:t xml:space="preserve"> igralčeva</w:t>
+      </w:r>
+      <w:r>
+        <w:rPr>
+          <w:color w:val="FF0000"/>
+        </w:rPr>
+        <w:t xml:space="preserve"> </w:t>
+      </w:r>
+      <w:r>
+        <w:rPr>
+          <w:color w:val="FF0000"/>
+        </w:rPr>
+        <w:t>izbira in še ena možnost.</w:t>
+      </w:r>
+      <w:r>
+        <w:t xml:space="preserve"> </w:t>
+      </w:r>
+      <w:r>
+        <w:rPr>
+          <w:color w:val="FF0000"/>
+        </w:rPr>
+        <w:t>S pomočjo generatorja naključnih števil izvedite simulacijo za:</w:t>
+      </w:r>
+    </w:p>
+    <w:p>
+      <w:pPr>
+        <w:pStyle w:val="Odstavekseznama"/>
+        <w:numPr>
+          <w:ilvl w:val="0"/>
+          <w:numId w:val="2"/>
+        </w:numPr>
+        <w:jc w:val="both"/>
+        <w:rPr>
+          <w:color w:val="FF0000"/>
+        </w:rPr>
+      </w:pPr>
+      <w:r>
+        <w:rPr>
+          <w:color w:val="FF0000"/>
+        </w:rPr>
+        <w:t>strategijo, pri kateri igralec vztraja pri prvotni izbiri,</w:t>
+      </w:r>
+    </w:p>
+    <w:p>
+      <w:pPr>
+        <w:pStyle w:val="Odstavekseznama"/>
+        <w:numPr>
+          <w:ilvl w:val="0"/>
+          <w:numId w:val="2"/>
+        </w:numPr>
+        <w:jc w:val="both"/>
+        <w:rPr>
+          <w:color w:val="FF0000"/>
+        </w:rPr>
+      </w:pPr>
+      <w:r>
+        <w:rPr>
+          <w:color w:val="FF0000"/>
+        </w:rPr>
+        <w:t>strategijo, pri kateri igralec vedno zamenja izbiro, ko voditelj odpre vrata.</w:t>
+      </w:r>
+    </w:p>
+    <w:p>
+      <w:pPr>
+        <w:jc w:val="both"/>
+        <w:rPr>
+          <w:color w:val="EE0000"/>
+        </w:rPr>
+      </w:pPr>
+      <w:r>
+        <w:rPr>
+          <w:color w:val="EE0000"/>
+        </w:rPr>
+        <w:t>Za vsak primer (4, 5 in 6 vrat) izvedite simulacijo za veliko število ponovitev. Beležite število zmag za obe strategiji ter izračunajte relativno verjetnost zmage.</w:t>
+      </w:r>
+    </w:p>
+    <w:p>
+      <w:pPr>
+        <w:jc w:val="both"/>
+        <w:rPr>
+          <w:color w:val="EE0000"/>
+        </w:rPr>
+      </w:pPr>
+    </w:p>
+    <w:p>
+      <w:pPr>
+        <w:pStyle w:val="Naslov"/>
+        <w:rPr>
+          <w:color w:val="FF0000"/>
+        </w:rPr>
+      </w:pPr>
+      <w:r>
+        <w:rPr>
+          <w:color w:val="FF0000"/>
+        </w:rPr>
+        <w:t>Domača naloga</w:t>
+      </w:r>
+      <w:r>
+        <w:rPr>
+          <w:color w:val="FF0000"/>
+        </w:rPr>
+        <w:t xml:space="preserve"> 2</w:t>
       </w:r>
     </w:p>
     <w:p>
@@ -384,8 +736,120 @@
 </file>
 
 <file path=word/numbering.xml><?xml version="1.0" encoding="utf-8"?>
-<w:numbering xmlns:wpc="http://schemas.microsoft.com/office/word/2010/wordprocessingCanvas" xmlns:cx="http://schemas.microsoft.com/office/drawing/2014/chartex" xmlns:cx1="http://schemas.microsoft.com/office/drawing/2015/9/8/chartex" xmlns:cx2="http://schemas.microsoft.com/office/drawing/2015/10/21/chartex" xmlns:cx3="http://schemas.microsoft.com/office/drawing/2016/5/9/chartex" xmlns:cx4="http://schemas.microsoft.com/office/drawing/2016/5/10/chartex" xmlns:cx5="http://schemas.microsoft.com/office/drawing/2016/5/11/chartex" xmlns:cx6="http://schemas.microsoft.com/office/drawing/2016/5/12/chartex" xmlns:cx7="http://schemas.microsoft.com/office/drawing/2016/5/13/chartex" xmlns:cx8="http://schemas.microsoft.com/office/drawing/2016/5/14/chartex" xmlns:mc="http://schemas.openxmlformats.org/markup-compatibility/2006" xmlns:aink="http://schemas.microsoft.com/office/drawing/2016/ink" xmlns:am3d="http://schemas.microsoft.com/office/drawing/2017/model3d" xmlns:o="urn:schemas-microsoft-com:office:office" xmlns:oel="http://schemas.microsoft.com/office/2019/extlst" xmlns:r="http://schemas.openxmlformats.org/officeDocument/2006/relationships" xmlns:m="http://schemas.openxmlformats.org/officeDocument/2006/math" xmlns:v="urn:schemas-microsoft-com:vml" xmlns:wp14="http://schemas.microsoft.com/office/word/2010/wordprocessingDrawing" xmlns:wp="http://schemas.openxmlformats.org/drawingml/2006/wordprocessingDrawing" xmlns:w10="urn:schemas-microsoft-com:office:word" xmlns:w="http://schemas.openxmlformats.org/wordprocessingml/2006/main" xmlns:w14="http://schemas.microsoft.com/office/word/2010/wordml" xmlns:w15="http://schemas.microsoft.com/office/word/2012/wordml" xmlns:w16cex="http://schemas.microsoft.com/office/word/2018/wordml/cex" xmlns:w16cid="http://schemas.microsoft.com/office/word/2016/wordml/cid" xmlns:w16="http://schemas.microsoft.com/office/word/2018/wordml" xmlns:w16du="http://schemas.microsoft.com/office/word/2023/wordml/word16du" xmlns:w16sdtdh="http://schemas.microsoft.com/office/word/2020/wordml/sdtdatahash" xmlns:w16se="http://schemas.microsoft.com/office/word/2015/wordml/symex" xmlns:wpg="http://schemas.microsoft.com/office/word/2010/wordprocessingGroup" xmlns:wpi="http://schemas.microsoft.com/office/word/2010/wordprocessingInk" xmlns:wne="http://schemas.microsoft.com/office/word/2006/wordml" xmlns:wps="http://schemas.microsoft.com/office/word/2010/wordprocessingShape" mc:Ignorable="w14 w15 w16se w16cid w16 w16cex w16sdtdh wp14">
+<w:numbering xmlns:wpc="http://schemas.microsoft.com/office/word/2010/wordprocessingCanvas" xmlns:cx="http://schemas.microsoft.com/office/drawing/2014/chartex" xmlns:cx1="http://schemas.microsoft.com/office/drawing/2015/9/8/chartex" xmlns:cx2="http://schemas.microsoft.com/office/drawing/2015/10/21/chartex" xmlns:cx3="http://schemas.microsoft.com/office/drawing/2016/5/9/chartex" xmlns:cx4="http://schemas.microsoft.com/office/drawing/2016/5/10/chartex" xmlns:cx5="http://schemas.microsoft.com/office/drawing/2016/5/11/chartex" xmlns:cx6="http://schemas.microsoft.com/office/drawing/2016/5/12/chartex" xmlns:cx7="http://schemas.microsoft.com/office/drawing/2016/5/13/chartex" xmlns:cx8="http://schemas.microsoft.com/office/drawing/2016/5/14/chartex" xmlns:mc="http://schemas.openxmlformats.org/markup-compatibility/2006" xmlns:aink="http://schemas.microsoft.com/office/drawing/2016/ink" xmlns:am3d="http://schemas.microsoft.com/office/drawing/2017/model3d" xmlns:o="urn:schemas-microsoft-com:office:office" xmlns:oel="http://schemas.microsoft.com/office/2019/extlst" xmlns:r="http://schemas.openxmlformats.org/officeDocument/2006/relationships" xmlns:m="http://schemas.openxmlformats.org/officeDocument/2006/math" xmlns:v="urn:schemas-microsoft-com:vml" xmlns:wp14="http://schemas.microsoft.com/office/word/2010/wordprocessingDrawing" xmlns:wp="http://schemas.openxmlformats.org/drawingml/2006/wordprocessingDrawing" xmlns:w10="urn:schemas-microsoft-com:office:word" xmlns:w="http://schemas.openxmlformats.org/wordprocessingml/2006/main" xmlns:w14="http://schemas.microsoft.com/office/word/2010/wordml" xmlns:w15="http://schemas.microsoft.com/office/word/2012/wordml" xmlns:w16cex="http://schemas.microsoft.com/office/word/2018/wordml/cex" xmlns:w16cid="http://schemas.microsoft.com/office/word/2016/wordml/cid" xmlns:w16="http://schemas.microsoft.com/office/word/2018/wordml" xmlns:w16du="http://schemas.microsoft.com/office/word/2023/wordml/word16du" xmlns:w16sdtdh="http://schemas.microsoft.com/office/word/2020/wordml/sdtdatahash" xmlns:w16sdtfl="http://schemas.microsoft.com/office/word/2024/wordml/sdtformatlock" xmlns:w16se="http://schemas.microsoft.com/office/word/2015/wordml/symex" xmlns:wpg="http://schemas.microsoft.com/office/word/2010/wordprocessingGroup" xmlns:wpi="http://schemas.microsoft.com/office/word/2010/wordprocessingInk" xmlns:wne="http://schemas.microsoft.com/office/word/2006/wordml" xmlns:wps="http://schemas.microsoft.com/office/word/2010/wordprocessingShape" mc:Ignorable="w14 w15 w16se w16cid w16 w16cex w16sdtdh w16sdtfl w16du wp14">
   <w:abstractNum w:abstractNumId="0" w15:restartNumberingAfterBreak="0">
+    <w:nsid w:val="299334D6"/>
+    <w:multiLevelType w:val="hybridMultilevel"/>
+    <w:tmpl w:val="5C5C9EF0"/>
+    <w:lvl w:ilvl="0" w:tplc="38CEB892">
+      <w:numFmt w:val="bullet"/>
+      <w:lvlText w:val="-"/>
+      <w:lvlJc w:val="left"/>
+      <w:pPr>
+        <w:ind w:left="720" w:hanging="360"/>
+      </w:pPr>
+      <w:rPr>
+        <w:rFonts w:ascii="Calibri" w:eastAsia="Calibri" w:hAnsi="Calibri" w:cs="Calibri" w:hint="default"/>
+      </w:rPr>
+    </w:lvl>
+    <w:lvl w:ilvl="1" w:tplc="04240003" w:tentative="1">
+      <w:start w:val="1"/>
+      <w:numFmt w:val="bullet"/>
+      <w:lvlText w:val="o"/>
+      <w:lvlJc w:val="left"/>
+      <w:pPr>
+        <w:ind w:left="1440" w:hanging="360"/>
+      </w:pPr>
+      <w:rPr>
+        <w:rFonts w:ascii="Courier New" w:hAnsi="Courier New" w:cs="Courier New" w:hint="default"/>
+      </w:rPr>
+    </w:lvl>
+    <w:lvl w:ilvl="2" w:tplc="04240005" w:tentative="1">
+      <w:start w:val="1"/>
+      <w:numFmt w:val="bullet"/>
+      <w:lvlText w:val=""/>
+      <w:lvlJc w:val="left"/>
+      <w:pPr>
+        <w:ind w:left="2160" w:hanging="360"/>
+      </w:pPr>
+      <w:rPr>
+        <w:rFonts w:ascii="Wingdings" w:hAnsi="Wingdings" w:hint="default"/>
+      </w:rPr>
+    </w:lvl>
+    <w:lvl w:ilvl="3" w:tplc="04240001" w:tentative="1">
+      <w:start w:val="1"/>
+      <w:numFmt w:val="bullet"/>
+      <w:lvlText w:val=""/>
+      <w:lvlJc w:val="left"/>
+      <w:pPr>
+        <w:ind w:left="2880" w:hanging="360"/>
+      </w:pPr>
+      <w:rPr>
+        <w:rFonts w:ascii="Symbol" w:hAnsi="Symbol" w:hint="default"/>
+      </w:rPr>
+    </w:lvl>
+    <w:lvl w:ilvl="4" w:tplc="04240003" w:tentative="1">
+      <w:start w:val="1"/>
+      <w:numFmt w:val="bullet"/>
+      <w:lvlText w:val="o"/>
+      <w:lvlJc w:val="left"/>
+      <w:pPr>
+        <w:ind w:left="3600" w:hanging="360"/>
+      </w:pPr>
+      <w:rPr>
+        <w:rFonts w:ascii="Courier New" w:hAnsi="Courier New" w:cs="Courier New" w:hint="default"/>
+      </w:rPr>
+    </w:lvl>
+    <w:lvl w:ilvl="5" w:tplc="04240005" w:tentative="1">
+      <w:start w:val="1"/>
+      <w:numFmt w:val="bullet"/>
+      <w:lvlText w:val=""/>
+      <w:lvlJc w:val="left"/>
+      <w:pPr>
+        <w:ind w:left="4320" w:hanging="360"/>
+      </w:pPr>
+      <w:rPr>
+        <w:rFonts w:ascii="Wingdings" w:hAnsi="Wingdings" w:hint="default"/>
+      </w:rPr>
+    </w:lvl>
+    <w:lvl w:ilvl="6" w:tplc="04240001" w:tentative="1">
+      <w:start w:val="1"/>
+      <w:numFmt w:val="bullet"/>
+      <w:lvlText w:val=""/>
+      <w:lvlJc w:val="left"/>
+      <w:pPr>
+        <w:ind w:left="5040" w:hanging="360"/>
+      </w:pPr>
+      <w:rPr>
+        <w:rFonts w:ascii="Symbol" w:hAnsi="Symbol" w:hint="default"/>
+      </w:rPr>
+    </w:lvl>
+    <w:lvl w:ilvl="7" w:tplc="04240003" w:tentative="1">
+      <w:start w:val="1"/>
+      <w:numFmt w:val="bullet"/>
+      <w:lvlText w:val="o"/>
+      <w:lvlJc w:val="left"/>
+      <w:pPr>
+        <w:ind w:left="5760" w:hanging="360"/>
+      </w:pPr>
+      <w:rPr>
+        <w:rFonts w:ascii="Courier New" w:hAnsi="Courier New" w:cs="Courier New" w:hint="default"/>
+      </w:rPr>
+    </w:lvl>
+    <w:lvl w:ilvl="8" w:tplc="04240005" w:tentative="1">
+      <w:start w:val="1"/>
+      <w:numFmt w:val="bullet"/>
+      <w:lvlText w:val=""/>
+      <w:lvlJc w:val="left"/>
+      <w:pPr>
+        <w:ind w:left="6480" w:hanging="360"/>
+      </w:pPr>
+      <w:rPr>
+        <w:rFonts w:ascii="Wingdings" w:hAnsi="Wingdings" w:hint="default"/>
+      </w:rPr>
+    </w:lvl>
+  </w:abstractNum>
+  <w:abstractNum w:abstractNumId="1" w15:restartNumberingAfterBreak="0">
     <w:nsid w:val="42CB2008"/>
     <w:multiLevelType w:val="multilevel"/>
     <w:tmpl w:val="1CFEC604"/>
@@ -472,13 +936,16 @@
     </w:lvl>
   </w:abstractNum>
   <w:num w:numId="1" w16cid:durableId="557059608">
+    <w:abstractNumId w:val="1"/>
+  </w:num>
+  <w:num w:numId="2" w16cid:durableId="124934213">
     <w:abstractNumId w:val="0"/>
   </w:num>
 </w:numbering>
 </file>
 
 <file path=word/styles.xml><?xml version="1.0" encoding="utf-8"?>
-<w:styles xmlns:mc="http://schemas.openxmlformats.org/markup-compatibility/2006" xmlns:r="http://schemas.openxmlformats.org/officeDocument/2006/relationships" xmlns:w="http://schemas.openxmlformats.org/wordprocessingml/2006/main" xmlns:w14="http://schemas.microsoft.com/office/word/2010/wordml" xmlns:w15="http://schemas.microsoft.com/office/word/2012/wordml" xmlns:w16cex="http://schemas.microsoft.com/office/word/2018/wordml/cex" xmlns:w16cid="http://schemas.microsoft.com/office/word/2016/wordml/cid" xmlns:w16="http://schemas.microsoft.com/office/word/2018/wordml" xmlns:w16sdtdh="http://schemas.microsoft.com/office/word/2020/wordml/sdtdatahash" xmlns:w16se="http://schemas.microsoft.com/office/word/2015/wordml/symex" mc:Ignorable="w14 w15 w16se w16cid w16 w16cex w16sdtdh">
+<w:styles xmlns:mc="http://schemas.openxmlformats.org/markup-compatibility/2006" xmlns:r="http://schemas.openxmlformats.org/officeDocument/2006/relationships" xmlns:w="http://schemas.openxmlformats.org/wordprocessingml/2006/main" xmlns:w14="http://schemas.microsoft.com/office/word/2010/wordml" xmlns:w15="http://schemas.microsoft.com/office/word/2012/wordml" xmlns:w16cex="http://schemas.microsoft.com/office/word/2018/wordml/cex" xmlns:w16cid="http://schemas.microsoft.com/office/word/2016/wordml/cid" xmlns:w16="http://schemas.microsoft.com/office/word/2018/wordml" xmlns:w16du="http://schemas.microsoft.com/office/word/2023/wordml/word16du" xmlns:w16sdtdh="http://schemas.microsoft.com/office/word/2020/wordml/sdtdatahash" xmlns:w16sdtfl="http://schemas.microsoft.com/office/word/2024/wordml/sdtformatlock" xmlns:w16se="http://schemas.microsoft.com/office/word/2015/wordml/symex" mc:Ignorable="w14 w15 w16se w16cid w16 w16cex w16sdtdh w16sdtfl w16du">
   <w:docDefaults>
     <w:rPrDefault>
       <w:rPr>
@@ -1085,6 +1552,7 @@
     <w:name w:val="Title"/>
     <w:basedOn w:val="Navaden"/>
     <w:next w:val="Navaden"/>
+    <w:link w:val="NaslovZnak"/>
     <w:uiPriority w:val="10"/>
     <w:qFormat/>
     <w:rsid w:val="009C31B6"/>
@@ -1122,6 +1590,30 @@
     </w:pPr>
     <w:rPr>
       <w:color w:val="5A5A5A"/>
+    </w:rPr>
+  </w:style>
+  <w:style w:type="paragraph" w:styleId="Odstavekseznama">
+    <w:name w:val="List Paragraph"/>
+    <w:basedOn w:val="Navaden"/>
+    <w:uiPriority w:val="34"/>
+    <w:qFormat/>
+    <w:rsid w:val="006F28C7"/>
+    <w:pPr>
+      <w:ind w:left="720"/>
+      <w:contextualSpacing/>
+    </w:pPr>
+  </w:style>
+  <w:style w:type="character" w:customStyle="1" w:styleId="NaslovZnak">
+    <w:name w:val="Naslov Znak"/>
+    <w:basedOn w:val="Privzetapisavaodstavka"/>
+    <w:link w:val="Naslov"/>
+    <w:uiPriority w:val="10"/>
+    <w:rsid w:val="006F28C7"/>
+    <w:rPr>
+      <w:b/>
+      <w:color w:val="000000"/>
+      <w:sz w:val="28"/>
+      <w:szCs w:val="56"/>
     </w:rPr>
   </w:style>
 </w:styles>

</xml_diff>